<commit_message>
ca8 reply-brief: Times New Roman on every engine (typst, latex newtxtext/newtxmath, docx), certificate "Times New Roman, 14-point"; latex XENG-001..003 pass and gate, docx pages and page ends pass, XENG-003 reported (fb-595.54.9)
Per the PM decision under David's 2026-10-17 ruling (Times New Roman is the standard). 18 pages on every engine, all
looked at. Tier 1: typst 8/8, latex 11/11, docx 11/11 (DEF-FORM-002, the Gelasio ascent on the docx PDF, is gone).
The footnote widow on p12/p13 is fixed in lib/typst/xengine.typ, so the TOA's Minn. Stat. 548.101(a)(5) is p7 on
every engine. latex: 400/400 lines after a 0.05 bp wider text (newtx set p9 line 11 0.035 bp wider than typst, which
fills it to 0.02 bp). docx: 397/400: p9 line 14 typst overflows by 0.07 pt and LibreOffice, deciding in whole twips,
keeps the word; a 1-twip indent fixes it and breaks p16 line 2, so eval.yaml sets cross_engine: gate and
cross_engine_docx: report, the reason beside it and in README.md (fb-595.54.9)
</commit_message>
<xml_diff>
--- a/courts/eighth-circuit/court-of-appeals/reply-brief/docx/reference.docx
+++ b/courts/eighth-circuit/court-of-appeals/reply-brief/docx/reference.docx
@@ -510,7 +510,7 @@
   <w:docDefaults>
     <w:rPrDefault>
       <w:rPr>
-        <w:rFonts w:ascii="Gelasio" w:hAnsi="Gelasio" w:eastAsia="Gelasio" w:cs="Gelasio"/>
+        <w:rFonts w:ascii="Times New Roman" w:hAnsi="Times New Roman" w:eastAsia="Times New Roman" w:cs="Times New Roman"/>
         <w:sz w:val="28"/>
         <w:szCs w:val="28"/>
         <w:lang w:val="en-US" w:eastAsia="zh-CN" w:bidi="ar-SA"/>
@@ -702,7 +702,7 @@
       <w:outlineLvl w:val="0"/>
     </w:pPr>
     <w:rPr>
-      <w:rFonts w:ascii="Gelasio" w:hAnsi="Gelasio" w:eastAsia="Gelasio" w:cs="Gelasio"/>
+      <w:rFonts w:ascii="Times New Roman" w:hAnsi="Times New Roman" w:eastAsia="Times New Roman" w:cs="Times New Roman"/>
       <w:b/>
       <w:bCs/>
       <w:caps/>
@@ -729,7 +729,7 @@
       <w:outlineLvl w:val="1"/>
     </w:pPr>
     <w:rPr>
-      <w:rFonts w:ascii="Gelasio" w:hAnsi="Gelasio" w:eastAsia="Gelasio" w:cs="Gelasio"/>
+      <w:rFonts w:ascii="Times New Roman" w:hAnsi="Times New Roman" w:eastAsia="Times New Roman" w:cs="Times New Roman"/>
       <w:b/>
       <w:bCs/>
       <w:color w:val="000000"/>
@@ -755,7 +755,7 @@
       <w:outlineLvl w:val="2"/>
     </w:pPr>
     <w:rPr>
-      <w:rFonts w:ascii="Gelasio" w:hAnsi="Gelasio" w:eastAsia="Gelasio" w:cs="Gelasio"/>
+      <w:rFonts w:ascii="Times New Roman" w:hAnsi="Times New Roman" w:eastAsia="Times New Roman" w:cs="Times New Roman"/>
       <w:b/>
       <w:bCs/>
       <w:color w:val="000000"/>
@@ -781,7 +781,7 @@
       <w:outlineLvl w:val="3"/>
     </w:pPr>
     <w:rPr>
-      <w:rFonts w:ascii="Gelasio" w:hAnsi="Gelasio" w:eastAsia="Gelasio" w:cs="Gelasio"/>
+      <w:rFonts w:ascii="Times New Roman" w:hAnsi="Times New Roman" w:eastAsia="Times New Roman" w:cs="Times New Roman"/>
       <w:b/>
       <w:bCs/>
       <w:i/>
@@ -808,7 +808,7 @@
       <w:outlineLvl w:val="4"/>
     </w:pPr>
     <w:rPr>
-      <w:rFonts w:ascii="Gelasio" w:hAnsi="Gelasio" w:eastAsia="Gelasio" w:cs="Gelasio"/>
+      <w:rFonts w:ascii="Times New Roman" w:hAnsi="Times New Roman" w:eastAsia="Times New Roman" w:cs="Times New Roman"/>
       <w:b/>
       <w:bCs/>
       <w:i/>

</xml_diff>